<commit_message>
Add repository link to final report
</commit_message>
<xml_diff>
--- a/docs/reporte.docx
+++ b/docs/reporte.docx
@@ -6453,10 +6453,12 @@
       <w:r>
         <w:rPr>
           <w:rFonts w:ascii="Calibri" w:cs="Calibri" w:eastAsia="Calibri" w:hAnsi="Calibri"/>
+          <w:color w:val="0563C1"/>
           <w:sz w:val="19"/>
           <w:szCs w:val="19"/>
-        </w:rPr>
-        <w:t xml:space="preserve">PENDIENTE — agregar enlace al repositorio Git</w:t>
+          <w:u w:val="single"/>
+        </w:rPr>
+        <w:t xml:space="preserve">https://github.com/PeDro0210AVI/Lab-07-deeplearning</w:t>
       </w:r>
     </w:p>
     <w:sectPr>

</xml_diff>